<commit_message>
Fix a structural defect in the CCI pass and add the check that catches it
Deleting the 'What it costs when the record is tested' heading did not move the
paragraphs under it. They reattached to the preceding section, so US discovery
and opposing-counsel material shipped under 'The European frame'.

All 17 checks passed because all 17 tested the document as a bag of strings.
None tested where anything was. PLACEMENT anchors 15 load-bearing paragraphs to
their sections; the check was regression-tested against the reconstructed defect
and detects all three misplaced paragraphs.

Co-Authored-By: Claude Opus 5 <noreply@anthropic.com>
Claude-Session: https://claude.ai/code/session_01W9UtE7X76spacWeSvBH7tv
</commit_message>
<xml_diff>
--- a/research/Evidentiary_Deficit_Article_CCI_SUBMISSION_2026-08-19.docx
+++ b/research/Evidentiary_Deficit_Article_CCI_SUBMISSION_2026-08-19.docx
@@ -189,6 +189,30 @@
     </w:p>
     <w:p>
       <w:pPr>
+        <w:spacing w:after="160" w:line="276" w:lineRule="auto"/>
+      </w:pPr>
+      <w:r>
+        <w:t xml:space="preserve">Opposing counsel tends to make two moves: that the fluent AI narrative was written to dress up a decision already made, and that missing drafting history and reviewer notes show there was no real deliberation. Both land harder when the organization cannot produce the underlying material.</w:t>
+      </w:r>
+    </w:p>
+    <w:p>
+      <w:pPr>
+        <w:spacing w:after="160" w:line="276" w:lineRule="auto"/>
+      </w:pPr>
+      <w:r>
+        <w:t xml:space="preserve">Depending on the dispute, preservation obligations and discovery requests may extend to materials showing how an AI-assisted record was created, reviewed, modified and finalized, including prompt logs, draft versions, tool-usage records and reviewer activity. Potential discoverability is not the same as an obligation to retain everything, and the two should not be conflated in policy. Regulators come at it differently. Uniform language across files can suggest a process running without individualized judgment, and gaps in processing documentation raise questions of their own.</w:t>
+      </w:r>
+    </w:p>
+    <w:p>
+      <w:pPr>
+        <w:spacing w:after="160" w:line="276" w:lineRule="auto"/>
+      </w:pPr>
+      <w:r>
+        <w:t xml:space="preserve">When an institution cannot explain its own decisions to the people they affect, it loses some of the accountability and public confidence it depends on to function.</w:t>
+      </w:r>
+    </w:p>
+    <w:p>
+      <w:pPr>
         <w:pStyle w:val="Heading2"/>
         <w:spacing w:before="360" w:after="120"/>
       </w:pPr>
@@ -280,30 +304,6 @@
       </w:hyperlink>
       <w:r>
         <w:t xml:space="preserve"> adds a documented ICT-risk and governance framework where applicable. Neither establishes any particular record-level control. The aim is not to retain everything but to preserve the right evidence, under the right controls, for the right period, so a consequential record can still account for itself when someone asks it to.</w:t>
-      </w:r>
-    </w:p>
-    <w:p>
-      <w:pPr>
-        <w:spacing w:after="160" w:line="276" w:lineRule="auto"/>
-      </w:pPr>
-      <w:r>
-        <w:t xml:space="preserve">Opposing counsel tends to make two moves: that the fluent AI narrative was written to dress up a decision already made, and that missing drafting history and reviewer notes show there was no real deliberation. Both land harder when the organization cannot produce the underlying material.</w:t>
-      </w:r>
-    </w:p>
-    <w:p>
-      <w:pPr>
-        <w:spacing w:after="160" w:line="276" w:lineRule="auto"/>
-      </w:pPr>
-      <w:r>
-        <w:t xml:space="preserve">Depending on the dispute, preservation obligations and discovery requests may extend to materials showing how an AI-assisted record was created, reviewed, modified and finalized, including prompt logs, draft versions, tool-usage records and reviewer activity. Potential discoverability is not the same as an obligation to retain everything, and the two should not be conflated in policy. Regulators come at it differently. Uniform language across files can suggest a process running without individualized judgment, and gaps in processing documentation raise questions of their own.</w:t>
-      </w:r>
-    </w:p>
-    <w:p>
-      <w:pPr>
-        <w:spacing w:after="160" w:line="276" w:lineRule="auto"/>
-      </w:pPr>
-      <w:r>
-        <w:t xml:space="preserve">When an institution cannot explain its own decisions to the people they affect, it loses some of the accountability and public confidence it depends on to function.</w:t>
       </w:r>
     </w:p>
     <w:p>

</xml_diff>

<commit_message>
Apply Hekim Colpan's two corrections and lock the manuscript
1. Introduction: GDPR accountability separated from AI Act documentation. The
   old sentence merged two instruments into a single obligation neither imposes.
2. Control 3: rewritten so AI-generated material is not excluded from the
   evidentiary record; the conclusion must not rest on it alone.

His 'organisations' carried as 'organizations' for AP conformance, disclosed to
him rather than changed silently. Both corrections pinned in PROTECTED and both
superseded wordings added to BANNED so neither can be undone by a later pass.

Co-Authored-By: Claude Opus 5 <noreply@anthropic.com>
Claude-Session: https://claude.ai/code/session_01W9UtE7X76spacWeSvBH7tv
</commit_message>
<xml_diff>
--- a/research/Evidentiary_Deficit_Article_CCI_SUBMISSION_2026-08-19.docx
+++ b/research/Evidentiary_Deficit_Article_CCI_SUBMISSION_2026-08-19.docx
@@ -61,7 +61,7 @@
         <w:spacing w:after="160" w:line="276" w:lineRule="auto"/>
       </w:pPr>
       <w:r>
-        <w:t xml:space="preserve">One of us works inside European AI governance and compliance. The other spent more than a decade at a U.S. civil rights agency reading consequential records after the fact, and kept finding a decision that was probably sound sitting on a record that could not prove it. In Europe, the GDPR's accountability principle and the EU AI Act's record-keeping expectations ask an organization to show how a decision was reached rather than assert it. In the United States no equivalent general obligation applies, but discovery and the burden-shifting frameworks that structure employment and housing cases can put an organization in the same position, needing to substantiate a consequential decision from the record it kept. The legal mechanisms differ. The demand on the record often converges.</w:t>
+        <w:t xml:space="preserve">One of us works inside European AI governance and compliance. The other spent more than a decade at a U.S. civil rights agency reading consequential records after the fact, and kept finding a decision that was probably sound sitting on a record that could not prove it. In Europe, the GDPR's accountability principle requires organizations to demonstrate compliance with applicable data-protection obligations, while the EU AI Act introduces more specific documentation, logging and oversight requirements where its relevant regimes apply. In the United States no equivalent general obligation applies, but discovery and the burden-shifting frameworks that structure employment and housing cases can put an organization in the same position, needing to substantiate a consequential decision from the record it kept. The legal mechanisms differ. The demand on the record often converges.</w:t>
       </w:r>
     </w:p>
     <w:p>
@@ -355,7 +355,7 @@
         <w:spacing w:after="60"/>
       </w:pPr>
       <w:r>
-        <w:t xml:space="preserve">3. Link conclusions to verifiable evidence that was not itself AI-generated.</w:t>
+        <w:t xml:space="preserve">3. Link conclusions to independently verifiable source evidence rather than to AI-generated assertions alone.</w:t>
       </w:r>
     </w:p>
     <w:p>

</xml_diff>